<commit_message>
Initial commit for Leave Management System
</commit_message>
<xml_diff>
--- a/Leave Management System- Documentation.docx
+++ b/Leave Management System- Documentation.docx
@@ -3332,6 +3332,25 @@
           <w:bCs/>
         </w:rPr>
       </w:pPr>
+      <w:hyperlink r:id="rId13" w:history="1">
+        <w:r>
+          <w:rPr>
+            <w:rStyle w:val="Hyperlink"/>
+            <w:rFonts w:ascii="Times New Roman" w:hAnsi="Times New Roman" w:cs="Times New Roman"/>
+            <w:b/>
+            <w:bCs/>
+          </w:rPr>
+          <w:t>https://drive.google.com/file/d/1WII3XRO8XMhrtc9CzNQd3BCvMppjm_ZI/view?usp=sharing</w:t>
+        </w:r>
+      </w:hyperlink>
+      <w:r>
+        <w:rPr>
+          <w:rFonts w:ascii="Times New Roman" w:hAnsi="Times New Roman" w:cs="Times New Roman"/>
+          <w:b/>
+          <w:bCs/>
+        </w:rPr>
+        <w:t xml:space="preserve"> </w:t>
+      </w:r>
     </w:p>
     <w:p>
       <w:pPr>
@@ -3381,6 +3400,7 @@
           <w:b/>
           <w:bCs/>
         </w:rPr>
+        <w:lastRenderedPageBreak/>
         <w:t>Backend</w:t>
       </w:r>
     </w:p>
@@ -3398,7 +3418,6 @@
         <w:rPr>
           <w:rFonts w:ascii="Times New Roman" w:hAnsi="Times New Roman" w:cs="Times New Roman"/>
         </w:rPr>
-        <w:lastRenderedPageBreak/>
         <w:t>Clone the repo</w:t>
       </w:r>
     </w:p>
@@ -3925,6 +3944,7 @@
         <w:rPr>
           <w:rFonts w:ascii="Times New Roman" w:hAnsi="Times New Roman" w:cs="Times New Roman"/>
         </w:rPr>
+        <w:lastRenderedPageBreak/>
         <w:t xml:space="preserve">  </w:t>
       </w:r>
       <w:proofErr w:type="spellStart"/>
@@ -3967,7 +3987,6 @@
         <w:rPr>
           <w:rFonts w:ascii="Times New Roman" w:hAnsi="Times New Roman" w:cs="Times New Roman"/>
         </w:rPr>
-        <w:lastRenderedPageBreak/>
         <w:t>);</w:t>
       </w:r>
       <w:proofErr w:type="gramEnd"/>
@@ -7380,6 +7399,7 @@
   <w:style w:type="character" w:default="1" w:styleId="DefaultParagraphFont">
     <w:name w:val="Default Paragraph Font"/>
     <w:uiPriority w:val="1"/>
+    <w:semiHidden/>
     <w:unhideWhenUsed/>
   </w:style>
   <w:style w:type="table" w:default="1" w:styleId="TableNormal">
@@ -7712,6 +7732,29 @@
       </w:tblBorders>
     </w:tblPr>
   </w:style>
+  <w:style w:type="character" w:styleId="Hyperlink">
+    <w:name w:val="Hyperlink"/>
+    <w:basedOn w:val="DefaultParagraphFont"/>
+    <w:uiPriority w:val="99"/>
+    <w:unhideWhenUsed/>
+    <w:rsid w:val="002F7C17"/>
+    <w:rPr>
+      <w:color w:val="467886" w:themeColor="hyperlink"/>
+      <w:u w:val="single"/>
+    </w:rPr>
+  </w:style>
+  <w:style w:type="character" w:styleId="UnresolvedMention">
+    <w:name w:val="Unresolved Mention"/>
+    <w:basedOn w:val="DefaultParagraphFont"/>
+    <w:uiPriority w:val="99"/>
+    <w:semiHidden/>
+    <w:unhideWhenUsed/>
+    <w:rsid w:val="002F7C17"/>
+    <w:rPr>
+      <w:color w:val="605E5C"/>
+      <w:shd w:val="clear" w:color="auto" w:fill="E1DFDD"/>
+    </w:rPr>
+  </w:style>
 </w:styles>
 </file>
 

</xml_diff>